<commit_message>
Added updated test code for present funtionalities
</commit_message>
<xml_diff>
--- a/backend/app/tests/reports/modules/test_inventory_api_documentation.docx
+++ b/backend/app/tests/reports/modules/test_inventory_api_documentation.docx
@@ -12,17 +12,17 @@
     </w:p>
     <w:p>
       <w:r>
-        <w:t>Generated at: 2026-06-29T05:14:49+00:00</w:t>
+        <w:t>Generated at: 2026-07-10T07:15:53+00:00</w:t>
       </w:r>
     </w:p>
     <w:p>
       <w:r>
-        <w:t>Test session started: 2026-06-29T05:14:40+00:00</w:t>
+        <w:t>Test session started: 2026-07-10T07:12:12+00:00</w:t>
       </w:r>
     </w:p>
     <w:p>
       <w:r>
-        <w:t>Pytest exit status: 0</w:t>
+        <w:t>Pytest exit status: 1</w:t>
       </w:r>
     </w:p>
     <w:p>
@@ -88,29 +88,29 @@
           </w:tcPr>
           <w:p>
             <w:r>
-              <w:t>21</w:t>
-            </w:r>
-          </w:p>
-        </w:tc>
-      </w:tr>
-      <w:tr>
-        <w:tc>
-          <w:tcPr>
-            <w:tcW w:w="2400" w:type="dxa"/>
-          </w:tcPr>
-          <w:p>
-            <w:r>
-              <w:t>Passed</w:t>
-            </w:r>
-          </w:p>
-        </w:tc>
-        <w:tc>
-          <w:tcPr>
-            <w:tcW w:w="2400" w:type="dxa"/>
-          </w:tcPr>
-          <w:p>
-            <w:r>
-              <w:t>21</w:t>
+              <w:t>25</w:t>
+            </w:r>
+          </w:p>
+        </w:tc>
+      </w:tr>
+      <w:tr>
+        <w:tc>
+          <w:tcPr>
+            <w:tcW w:w="2400" w:type="dxa"/>
+          </w:tcPr>
+          <w:p>
+            <w:r>
+              <w:t>Passed</w:t>
+            </w:r>
+          </w:p>
+        </w:tc>
+        <w:tc>
+          <w:tcPr>
+            <w:tcW w:w="2400" w:type="dxa"/>
+          </w:tcPr>
+          <w:p>
+            <w:r>
+              <w:t>25</w:t>
             </w:r>
           </w:p>
         </w:tc>
@@ -318,6 +318,78 @@
           </w:tcPr>
           <w:p>
             <w:r>
+              <w:t>test_compare_more_than_four_400</w:t>
+            </w:r>
+          </w:p>
+        </w:tc>
+        <w:tc>
+          <w:tcPr>
+            <w:tcW w:w="2400" w:type="dxa"/>
+          </w:tcPr>
+          <w:p>
+            <w:r>
+              <w:t>Passing more than 4 IDs to /compare must return 400.</w:t>
+            </w:r>
+          </w:p>
+        </w:tc>
+        <w:tc>
+          <w:tcPr>
+            <w:tcW w:w="2400" w:type="dxa"/>
+          </w:tcPr>
+          <w:p>
+            <w:r>
+              <w:t>Passed</w:t>
+            </w:r>
+          </w:p>
+        </w:tc>
+        <w:tc>
+          <w:tcPr>
+            <w:tcW w:w="2400" w:type="dxa"/>
+          </w:tcPr>
+          <w:p>
+            <w:r>
+              <w:t>0.819</w:t>
+            </w:r>
+          </w:p>
+        </w:tc>
+        <w:tc>
+          <w:tcPr>
+            <w:tcW w:w="2400" w:type="dxa"/>
+          </w:tcPr>
+          <w:p>
+            <w:r>
+              <w:t>asyncio</w:t>
+            </w:r>
+          </w:p>
+        </w:tc>
+        <w:tc>
+          <w:tcPr>
+            <w:tcW w:w="2400" w:type="dxa"/>
+          </w:tcPr>
+          <w:p>
+            <w:r>
+              <w:t>-</w:t>
+            </w:r>
+          </w:p>
+        </w:tc>
+      </w:tr>
+      <w:tr>
+        <w:tc>
+          <w:tcPr>
+            <w:tcW w:w="2400" w:type="dxa"/>
+          </w:tcPr>
+          <w:p>
+            <w:r>
+              <w:t>2</w:t>
+            </w:r>
+          </w:p>
+        </w:tc>
+        <w:tc>
+          <w:tcPr>
+            <w:tcW w:w="2400" w:type="dxa"/>
+          </w:tcPr>
+          <w:p>
+            <w:r>
               <w:t>test_compare_not_found_404</w:t>
             </w:r>
           </w:p>
@@ -348,39 +420,39 @@
           </w:tcPr>
           <w:p>
             <w:r>
-              <w:t>0.459</w:t>
-            </w:r>
-          </w:p>
-        </w:tc>
-        <w:tc>
-          <w:tcPr>
-            <w:tcW w:w="2400" w:type="dxa"/>
-          </w:tcPr>
-          <w:p>
-            <w:r>
-              <w:t>asyncio</w:t>
-            </w:r>
-          </w:p>
-        </w:tc>
-        <w:tc>
-          <w:tcPr>
-            <w:tcW w:w="2400" w:type="dxa"/>
-          </w:tcPr>
-          <w:p>
-            <w:r>
-              <w:t>-</w:t>
-            </w:r>
-          </w:p>
-        </w:tc>
-      </w:tr>
-      <w:tr>
-        <w:tc>
-          <w:tcPr>
-            <w:tcW w:w="2400" w:type="dxa"/>
-          </w:tcPr>
-          <w:p>
-            <w:r>
-              <w:t>2</w:t>
+              <w:t>0.823</w:t>
+            </w:r>
+          </w:p>
+        </w:tc>
+        <w:tc>
+          <w:tcPr>
+            <w:tcW w:w="2400" w:type="dxa"/>
+          </w:tcPr>
+          <w:p>
+            <w:r>
+              <w:t>asyncio</w:t>
+            </w:r>
+          </w:p>
+        </w:tc>
+        <w:tc>
+          <w:tcPr>
+            <w:tcW w:w="2400" w:type="dxa"/>
+          </w:tcPr>
+          <w:p>
+            <w:r>
+              <w:t>-</w:t>
+            </w:r>
+          </w:p>
+        </w:tc>
+      </w:tr>
+      <w:tr>
+        <w:tc>
+          <w:tcPr>
+            <w:tcW w:w="2400" w:type="dxa"/>
+          </w:tcPr>
+          <w:p>
+            <w:r>
+              <w:t>3</w:t>
             </w:r>
           </w:p>
         </w:tc>
@@ -420,39 +492,39 @@
           </w:tcPr>
           <w:p>
             <w:r>
-              <w:t>0.438</w:t>
-            </w:r>
-          </w:p>
-        </w:tc>
-        <w:tc>
-          <w:tcPr>
-            <w:tcW w:w="2400" w:type="dxa"/>
-          </w:tcPr>
-          <w:p>
-            <w:r>
-              <w:t>asyncio</w:t>
-            </w:r>
-          </w:p>
-        </w:tc>
-        <w:tc>
-          <w:tcPr>
-            <w:tcW w:w="2400" w:type="dxa"/>
-          </w:tcPr>
-          <w:p>
-            <w:r>
-              <w:t>-</w:t>
-            </w:r>
-          </w:p>
-        </w:tc>
-      </w:tr>
-      <w:tr>
-        <w:tc>
-          <w:tcPr>
-            <w:tcW w:w="2400" w:type="dxa"/>
-          </w:tcPr>
-          <w:p>
-            <w:r>
-              <w:t>3</w:t>
+              <w:t>0.793</w:t>
+            </w:r>
+          </w:p>
+        </w:tc>
+        <w:tc>
+          <w:tcPr>
+            <w:tcW w:w="2400" w:type="dxa"/>
+          </w:tcPr>
+          <w:p>
+            <w:r>
+              <w:t>asyncio</w:t>
+            </w:r>
+          </w:p>
+        </w:tc>
+        <w:tc>
+          <w:tcPr>
+            <w:tcW w:w="2400" w:type="dxa"/>
+          </w:tcPr>
+          <w:p>
+            <w:r>
+              <w:t>-</w:t>
+            </w:r>
+          </w:p>
+        </w:tc>
+      </w:tr>
+      <w:tr>
+        <w:tc>
+          <w:tcPr>
+            <w:tcW w:w="2400" w:type="dxa"/>
+          </w:tcPr>
+          <w:p>
+            <w:r>
+              <w:t>4</w:t>
             </w:r>
           </w:p>
         </w:tc>
@@ -492,39 +564,255 @@
           </w:tcPr>
           <w:p>
             <w:r>
-              <w:t>0.464</w:t>
-            </w:r>
-          </w:p>
-        </w:tc>
-        <w:tc>
-          <w:tcPr>
-            <w:tcW w:w="2400" w:type="dxa"/>
-          </w:tcPr>
-          <w:p>
-            <w:r>
-              <w:t>asyncio</w:t>
-            </w:r>
-          </w:p>
-        </w:tc>
-        <w:tc>
-          <w:tcPr>
-            <w:tcW w:w="2400" w:type="dxa"/>
-          </w:tcPr>
-          <w:p>
-            <w:r>
-              <w:t>-</w:t>
-            </w:r>
-          </w:p>
-        </w:tc>
-      </w:tr>
-      <w:tr>
-        <w:tc>
-          <w:tcPr>
-            <w:tcW w:w="2400" w:type="dxa"/>
-          </w:tcPr>
-          <w:p>
-            <w:r>
-              <w:t>4</w:t>
+              <w:t>0.844</w:t>
+            </w:r>
+          </w:p>
+        </w:tc>
+        <w:tc>
+          <w:tcPr>
+            <w:tcW w:w="2400" w:type="dxa"/>
+          </w:tcPr>
+          <w:p>
+            <w:r>
+              <w:t>asyncio</w:t>
+            </w:r>
+          </w:p>
+        </w:tc>
+        <w:tc>
+          <w:tcPr>
+            <w:tcW w:w="2400" w:type="dxa"/>
+          </w:tcPr>
+          <w:p>
+            <w:r>
+              <w:t>-</w:t>
+            </w:r>
+          </w:p>
+        </w:tc>
+      </w:tr>
+      <w:tr>
+        <w:tc>
+          <w:tcPr>
+            <w:tcW w:w="2400" w:type="dxa"/>
+          </w:tcPr>
+          <w:p>
+            <w:r>
+              <w:t>5</w:t>
+            </w:r>
+          </w:p>
+        </w:tc>
+        <w:tc>
+          <w:tcPr>
+            <w:tcW w:w="2400" w:type="dxa"/>
+          </w:tcPr>
+          <w:p>
+            <w:r>
+              <w:t>test_filter_by_autopilot</w:t>
+            </w:r>
+          </w:p>
+        </w:tc>
+        <w:tc>
+          <w:tcPr>
+            <w:tcW w:w="2400" w:type="dxa"/>
+          </w:tcPr>
+          <w:p>
+            <w:r>
+              <w:t>Filtering by autopilot=ArduPilot must include the fixture drone type | and return a valid catalogue response.</w:t>
+            </w:r>
+          </w:p>
+        </w:tc>
+        <w:tc>
+          <w:tcPr>
+            <w:tcW w:w="2400" w:type="dxa"/>
+          </w:tcPr>
+          <w:p>
+            <w:r>
+              <w:t>Passed</w:t>
+            </w:r>
+          </w:p>
+        </w:tc>
+        <w:tc>
+          <w:tcPr>
+            <w:tcW w:w="2400" w:type="dxa"/>
+          </w:tcPr>
+          <w:p>
+            <w:r>
+              <w:t>0.865</w:t>
+            </w:r>
+          </w:p>
+        </w:tc>
+        <w:tc>
+          <w:tcPr>
+            <w:tcW w:w="2400" w:type="dxa"/>
+          </w:tcPr>
+          <w:p>
+            <w:r>
+              <w:t>asyncio</w:t>
+            </w:r>
+          </w:p>
+        </w:tc>
+        <w:tc>
+          <w:tcPr>
+            <w:tcW w:w="2400" w:type="dxa"/>
+          </w:tcPr>
+          <w:p>
+            <w:r>
+              <w:t>-</w:t>
+            </w:r>
+          </w:p>
+        </w:tc>
+      </w:tr>
+      <w:tr>
+        <w:tc>
+          <w:tcPr>
+            <w:tcW w:w="2400" w:type="dxa"/>
+          </w:tcPr>
+          <w:p>
+            <w:r>
+              <w:t>6</w:t>
+            </w:r>
+          </w:p>
+        </w:tc>
+        <w:tc>
+          <w:tcPr>
+            <w:tcW w:w="2400" w:type="dxa"/>
+          </w:tcPr>
+          <w:p>
+            <w:r>
+              <w:t>test_filter_by_mission_type</w:t>
+            </w:r>
+          </w:p>
+        </w:tc>
+        <w:tc>
+          <w:tcPr>
+            <w:tcW w:w="2400" w:type="dxa"/>
+          </w:tcPr>
+          <w:p>
+            <w:r>
+              <w:t>Filtering by mission_type=ISR must include the fixture drone type | (whose mission_type is ISR) and not 404 or 500.</w:t>
+            </w:r>
+          </w:p>
+        </w:tc>
+        <w:tc>
+          <w:tcPr>
+            <w:tcW w:w="2400" w:type="dxa"/>
+          </w:tcPr>
+          <w:p>
+            <w:r>
+              <w:t>Passed</w:t>
+            </w:r>
+          </w:p>
+        </w:tc>
+        <w:tc>
+          <w:tcPr>
+            <w:tcW w:w="2400" w:type="dxa"/>
+          </w:tcPr>
+          <w:p>
+            <w:r>
+              <w:t>0.815</w:t>
+            </w:r>
+          </w:p>
+        </w:tc>
+        <w:tc>
+          <w:tcPr>
+            <w:tcW w:w="2400" w:type="dxa"/>
+          </w:tcPr>
+          <w:p>
+            <w:r>
+              <w:t>asyncio</w:t>
+            </w:r>
+          </w:p>
+        </w:tc>
+        <w:tc>
+          <w:tcPr>
+            <w:tcW w:w="2400" w:type="dxa"/>
+          </w:tcPr>
+          <w:p>
+            <w:r>
+              <w:t>-</w:t>
+            </w:r>
+          </w:p>
+        </w:tc>
+      </w:tr>
+      <w:tr>
+        <w:tc>
+          <w:tcPr>
+            <w:tcW w:w="2400" w:type="dxa"/>
+          </w:tcPr>
+          <w:p>
+            <w:r>
+              <w:t>7</w:t>
+            </w:r>
+          </w:p>
+        </w:tc>
+        <w:tc>
+          <w:tcPr>
+            <w:tcW w:w="2400" w:type="dxa"/>
+          </w:tcPr>
+          <w:p>
+            <w:r>
+              <w:t>test_filter_by_unknown_mission_type_returns_empty</w:t>
+            </w:r>
+          </w:p>
+        </w:tc>
+        <w:tc>
+          <w:tcPr>
+            <w:tcW w:w="2400" w:type="dxa"/>
+          </w:tcPr>
+          <w:p>
+            <w:r>
+              <w:t>Unknown mission_type filter must return 200 with total==0.</w:t>
+            </w:r>
+          </w:p>
+        </w:tc>
+        <w:tc>
+          <w:tcPr>
+            <w:tcW w:w="2400" w:type="dxa"/>
+          </w:tcPr>
+          <w:p>
+            <w:r>
+              <w:t>Passed</w:t>
+            </w:r>
+          </w:p>
+        </w:tc>
+        <w:tc>
+          <w:tcPr>
+            <w:tcW w:w="2400" w:type="dxa"/>
+          </w:tcPr>
+          <w:p>
+            <w:r>
+              <w:t>0.387</w:t>
+            </w:r>
+          </w:p>
+        </w:tc>
+        <w:tc>
+          <w:tcPr>
+            <w:tcW w:w="2400" w:type="dxa"/>
+          </w:tcPr>
+          <w:p>
+            <w:r>
+              <w:t>asyncio</w:t>
+            </w:r>
+          </w:p>
+        </w:tc>
+        <w:tc>
+          <w:tcPr>
+            <w:tcW w:w="2400" w:type="dxa"/>
+          </w:tcPr>
+          <w:p>
+            <w:r>
+              <w:t>-</w:t>
+            </w:r>
+          </w:p>
+        </w:tc>
+      </w:tr>
+      <w:tr>
+        <w:tc>
+          <w:tcPr>
+            <w:tcW w:w="2400" w:type="dxa"/>
+          </w:tcPr>
+          <w:p>
+            <w:r>
+              <w:t>8</w:t>
             </w:r>
           </w:p>
         </w:tc>
@@ -564,39 +852,39 @@
           </w:tcPr>
           <w:p>
             <w:r>
-              <w:t>0.471</w:t>
-            </w:r>
-          </w:p>
-        </w:tc>
-        <w:tc>
-          <w:tcPr>
-            <w:tcW w:w="2400" w:type="dxa"/>
-          </w:tcPr>
-          <w:p>
-            <w:r>
-              <w:t>asyncio</w:t>
-            </w:r>
-          </w:p>
-        </w:tc>
-        <w:tc>
-          <w:tcPr>
-            <w:tcW w:w="2400" w:type="dxa"/>
-          </w:tcPr>
-          <w:p>
-            <w:r>
-              <w:t>-</w:t>
-            </w:r>
-          </w:p>
-        </w:tc>
-      </w:tr>
-      <w:tr>
-        <w:tc>
-          <w:tcPr>
-            <w:tcW w:w="2400" w:type="dxa"/>
-          </w:tcPr>
-          <w:p>
-            <w:r>
-              <w:t>5</w:t>
+              <w:t>0.814</w:t>
+            </w:r>
+          </w:p>
+        </w:tc>
+        <w:tc>
+          <w:tcPr>
+            <w:tcW w:w="2400" w:type="dxa"/>
+          </w:tcPr>
+          <w:p>
+            <w:r>
+              <w:t>asyncio</w:t>
+            </w:r>
+          </w:p>
+        </w:tc>
+        <w:tc>
+          <w:tcPr>
+            <w:tcW w:w="2400" w:type="dxa"/>
+          </w:tcPr>
+          <w:p>
+            <w:r>
+              <w:t>-</w:t>
+            </w:r>
+          </w:p>
+        </w:tc>
+      </w:tr>
+      <w:tr>
+        <w:tc>
+          <w:tcPr>
+            <w:tcW w:w="2400" w:type="dxa"/>
+          </w:tcPr>
+          <w:p>
+            <w:r>
+              <w:t>9</w:t>
             </w:r>
           </w:p>
         </w:tc>
@@ -636,39 +924,39 @@
           </w:tcPr>
           <w:p>
             <w:r>
-              <w:t>0.230</w:t>
-            </w:r>
-          </w:p>
-        </w:tc>
-        <w:tc>
-          <w:tcPr>
-            <w:tcW w:w="2400" w:type="dxa"/>
-          </w:tcPr>
-          <w:p>
-            <w:r>
-              <w:t>asyncio</w:t>
-            </w:r>
-          </w:p>
-        </w:tc>
-        <w:tc>
-          <w:tcPr>
-            <w:tcW w:w="2400" w:type="dxa"/>
-          </w:tcPr>
-          <w:p>
-            <w:r>
-              <w:t>-</w:t>
-            </w:r>
-          </w:p>
-        </w:tc>
-      </w:tr>
-      <w:tr>
-        <w:tc>
-          <w:tcPr>
-            <w:tcW w:w="2400" w:type="dxa"/>
-          </w:tcPr>
-          <w:p>
-            <w:r>
-              <w:t>6</w:t>
+              <w:t>0.433</w:t>
+            </w:r>
+          </w:p>
+        </w:tc>
+        <w:tc>
+          <w:tcPr>
+            <w:tcW w:w="2400" w:type="dxa"/>
+          </w:tcPr>
+          <w:p>
+            <w:r>
+              <w:t>asyncio</w:t>
+            </w:r>
+          </w:p>
+        </w:tc>
+        <w:tc>
+          <w:tcPr>
+            <w:tcW w:w="2400" w:type="dxa"/>
+          </w:tcPr>
+          <w:p>
+            <w:r>
+              <w:t>-</w:t>
+            </w:r>
+          </w:p>
+        </w:tc>
+      </w:tr>
+      <w:tr>
+        <w:tc>
+          <w:tcPr>
+            <w:tcW w:w="2400" w:type="dxa"/>
+          </w:tcPr>
+          <w:p>
+            <w:r>
+              <w:t>10</w:t>
             </w:r>
           </w:p>
         </w:tc>
@@ -708,39 +996,39 @@
           </w:tcPr>
           <w:p>
             <w:r>
-              <w:t>0.019</w:t>
-            </w:r>
-          </w:p>
-        </w:tc>
-        <w:tc>
-          <w:tcPr>
-            <w:tcW w:w="2400" w:type="dxa"/>
-          </w:tcPr>
-          <w:p>
-            <w:r>
-              <w:t>asyncio</w:t>
-            </w:r>
-          </w:p>
-        </w:tc>
-        <w:tc>
-          <w:tcPr>
-            <w:tcW w:w="2400" w:type="dxa"/>
-          </w:tcPr>
-          <w:p>
-            <w:r>
-              <w:t>-</w:t>
-            </w:r>
-          </w:p>
-        </w:tc>
-      </w:tr>
-      <w:tr>
-        <w:tc>
-          <w:tcPr>
-            <w:tcW w:w="2400" w:type="dxa"/>
-          </w:tcPr>
-          <w:p>
-            <w:r>
-              <w:t>7</w:t>
+              <w:t>0.027</w:t>
+            </w:r>
+          </w:p>
+        </w:tc>
+        <w:tc>
+          <w:tcPr>
+            <w:tcW w:w="2400" w:type="dxa"/>
+          </w:tcPr>
+          <w:p>
+            <w:r>
+              <w:t>asyncio</w:t>
+            </w:r>
+          </w:p>
+        </w:tc>
+        <w:tc>
+          <w:tcPr>
+            <w:tcW w:w="2400" w:type="dxa"/>
+          </w:tcPr>
+          <w:p>
+            <w:r>
+              <w:t>-</w:t>
+            </w:r>
+          </w:p>
+        </w:tc>
+      </w:tr>
+      <w:tr>
+        <w:tc>
+          <w:tcPr>
+            <w:tcW w:w="2400" w:type="dxa"/>
+          </w:tcPr>
+          <w:p>
+            <w:r>
+              <w:t>11</w:t>
             </w:r>
           </w:p>
         </w:tc>
@@ -780,39 +1068,39 @@
           </w:tcPr>
           <w:p>
             <w:r>
-              <w:t>0.010</w:t>
-            </w:r>
-          </w:p>
-        </w:tc>
-        <w:tc>
-          <w:tcPr>
-            <w:tcW w:w="2400" w:type="dxa"/>
-          </w:tcPr>
-          <w:p>
-            <w:r>
-              <w:t>asyncio</w:t>
-            </w:r>
-          </w:p>
-        </w:tc>
-        <w:tc>
-          <w:tcPr>
-            <w:tcW w:w="2400" w:type="dxa"/>
-          </w:tcPr>
-          <w:p>
-            <w:r>
-              <w:t>-</w:t>
-            </w:r>
-          </w:p>
-        </w:tc>
-      </w:tr>
-      <w:tr>
-        <w:tc>
-          <w:tcPr>
-            <w:tcW w:w="2400" w:type="dxa"/>
-          </w:tcPr>
-          <w:p>
-            <w:r>
-              <w:t>8</w:t>
+              <w:t>0.029</w:t>
+            </w:r>
+          </w:p>
+        </w:tc>
+        <w:tc>
+          <w:tcPr>
+            <w:tcW w:w="2400" w:type="dxa"/>
+          </w:tcPr>
+          <w:p>
+            <w:r>
+              <w:t>asyncio</w:t>
+            </w:r>
+          </w:p>
+        </w:tc>
+        <w:tc>
+          <w:tcPr>
+            <w:tcW w:w="2400" w:type="dxa"/>
+          </w:tcPr>
+          <w:p>
+            <w:r>
+              <w:t>-</w:t>
+            </w:r>
+          </w:p>
+        </w:tc>
+      </w:tr>
+      <w:tr>
+        <w:tc>
+          <w:tcPr>
+            <w:tcW w:w="2400" w:type="dxa"/>
+          </w:tcPr>
+          <w:p>
+            <w:r>
+              <w:t>12</w:t>
             </w:r>
           </w:p>
         </w:tc>
@@ -852,39 +1140,39 @@
           </w:tcPr>
           <w:p>
             <w:r>
-              <w:t>1.633</w:t>
-            </w:r>
-          </w:p>
-        </w:tc>
-        <w:tc>
-          <w:tcPr>
-            <w:tcW w:w="2400" w:type="dxa"/>
-          </w:tcPr>
-          <w:p>
-            <w:r>
-              <w:t>asyncio</w:t>
-            </w:r>
-          </w:p>
-        </w:tc>
-        <w:tc>
-          <w:tcPr>
-            <w:tcW w:w="2400" w:type="dxa"/>
-          </w:tcPr>
-          <w:p>
-            <w:r>
-              <w:t>-</w:t>
-            </w:r>
-          </w:p>
-        </w:tc>
-      </w:tr>
-      <w:tr>
-        <w:tc>
-          <w:tcPr>
-            <w:tcW w:w="2400" w:type="dxa"/>
-          </w:tcPr>
-          <w:p>
-            <w:r>
-              <w:t>9</w:t>
+              <w:t>0.912</w:t>
+            </w:r>
+          </w:p>
+        </w:tc>
+        <w:tc>
+          <w:tcPr>
+            <w:tcW w:w="2400" w:type="dxa"/>
+          </w:tcPr>
+          <w:p>
+            <w:r>
+              <w:t>asyncio</w:t>
+            </w:r>
+          </w:p>
+        </w:tc>
+        <w:tc>
+          <w:tcPr>
+            <w:tcW w:w="2400" w:type="dxa"/>
+          </w:tcPr>
+          <w:p>
+            <w:r>
+              <w:t>-</w:t>
+            </w:r>
+          </w:p>
+        </w:tc>
+      </w:tr>
+      <w:tr>
+        <w:tc>
+          <w:tcPr>
+            <w:tcW w:w="2400" w:type="dxa"/>
+          </w:tcPr>
+          <w:p>
+            <w:r>
+              <w:t>13</w:t>
             </w:r>
           </w:p>
         </w:tc>
@@ -924,39 +1212,39 @@
           </w:tcPr>
           <w:p>
             <w:r>
-              <w:t>0.458</w:t>
-            </w:r>
-          </w:p>
-        </w:tc>
-        <w:tc>
-          <w:tcPr>
-            <w:tcW w:w="2400" w:type="dxa"/>
-          </w:tcPr>
-          <w:p>
-            <w:r>
-              <w:t>asyncio</w:t>
-            </w:r>
-          </w:p>
-        </w:tc>
-        <w:tc>
-          <w:tcPr>
-            <w:tcW w:w="2400" w:type="dxa"/>
-          </w:tcPr>
-          <w:p>
-            <w:r>
-              <w:t>-</w:t>
-            </w:r>
-          </w:p>
-        </w:tc>
-      </w:tr>
-      <w:tr>
-        <w:tc>
-          <w:tcPr>
-            <w:tcW w:w="2400" w:type="dxa"/>
-          </w:tcPr>
-          <w:p>
-            <w:r>
-              <w:t>10</w:t>
+              <w:t>0.834</w:t>
+            </w:r>
+          </w:p>
+        </w:tc>
+        <w:tc>
+          <w:tcPr>
+            <w:tcW w:w="2400" w:type="dxa"/>
+          </w:tcPr>
+          <w:p>
+            <w:r>
+              <w:t>asyncio</w:t>
+            </w:r>
+          </w:p>
+        </w:tc>
+        <w:tc>
+          <w:tcPr>
+            <w:tcW w:w="2400" w:type="dxa"/>
+          </w:tcPr>
+          <w:p>
+            <w:r>
+              <w:t>-</w:t>
+            </w:r>
+          </w:p>
+        </w:tc>
+      </w:tr>
+      <w:tr>
+        <w:tc>
+          <w:tcPr>
+            <w:tcW w:w="2400" w:type="dxa"/>
+          </w:tcPr>
+          <w:p>
+            <w:r>
+              <w:t>14</w:t>
             </w:r>
           </w:p>
         </w:tc>
@@ -996,39 +1284,39 @@
           </w:tcPr>
           <w:p>
             <w:r>
-              <w:t>0.236</w:t>
-            </w:r>
-          </w:p>
-        </w:tc>
-        <w:tc>
-          <w:tcPr>
-            <w:tcW w:w="2400" w:type="dxa"/>
-          </w:tcPr>
-          <w:p>
-            <w:r>
-              <w:t>asyncio</w:t>
-            </w:r>
-          </w:p>
-        </w:tc>
-        <w:tc>
-          <w:tcPr>
-            <w:tcW w:w="2400" w:type="dxa"/>
-          </w:tcPr>
-          <w:p>
-            <w:r>
-              <w:t>-</w:t>
-            </w:r>
-          </w:p>
-        </w:tc>
-      </w:tr>
-      <w:tr>
-        <w:tc>
-          <w:tcPr>
-            <w:tcW w:w="2400" w:type="dxa"/>
-          </w:tcPr>
-          <w:p>
-            <w:r>
-              <w:t>11</w:t>
+              <w:t>0.403</w:t>
+            </w:r>
+          </w:p>
+        </w:tc>
+        <w:tc>
+          <w:tcPr>
+            <w:tcW w:w="2400" w:type="dxa"/>
+          </w:tcPr>
+          <w:p>
+            <w:r>
+              <w:t>asyncio</w:t>
+            </w:r>
+          </w:p>
+        </w:tc>
+        <w:tc>
+          <w:tcPr>
+            <w:tcW w:w="2400" w:type="dxa"/>
+          </w:tcPr>
+          <w:p>
+            <w:r>
+              <w:t>-</w:t>
+            </w:r>
+          </w:p>
+        </w:tc>
+      </w:tr>
+      <w:tr>
+        <w:tc>
+          <w:tcPr>
+            <w:tcW w:w="2400" w:type="dxa"/>
+          </w:tcPr>
+          <w:p>
+            <w:r>
+              <w:t>15</w:t>
             </w:r>
           </w:p>
         </w:tc>
@@ -1068,39 +1356,39 @@
           </w:tcPr>
           <w:p>
             <w:r>
-              <w:t>0.237</w:t>
-            </w:r>
-          </w:p>
-        </w:tc>
-        <w:tc>
-          <w:tcPr>
-            <w:tcW w:w="2400" w:type="dxa"/>
-          </w:tcPr>
-          <w:p>
-            <w:r>
-              <w:t>asyncio</w:t>
-            </w:r>
-          </w:p>
-        </w:tc>
-        <w:tc>
-          <w:tcPr>
-            <w:tcW w:w="2400" w:type="dxa"/>
-          </w:tcPr>
-          <w:p>
-            <w:r>
-              <w:t>-</w:t>
-            </w:r>
-          </w:p>
-        </w:tc>
-      </w:tr>
-      <w:tr>
-        <w:tc>
-          <w:tcPr>
-            <w:tcW w:w="2400" w:type="dxa"/>
-          </w:tcPr>
-          <w:p>
-            <w:r>
-              <w:t>12</w:t>
+              <w:t>0.399</w:t>
+            </w:r>
+          </w:p>
+        </w:tc>
+        <w:tc>
+          <w:tcPr>
+            <w:tcW w:w="2400" w:type="dxa"/>
+          </w:tcPr>
+          <w:p>
+            <w:r>
+              <w:t>asyncio</w:t>
+            </w:r>
+          </w:p>
+        </w:tc>
+        <w:tc>
+          <w:tcPr>
+            <w:tcW w:w="2400" w:type="dxa"/>
+          </w:tcPr>
+          <w:p>
+            <w:r>
+              <w:t>-</w:t>
+            </w:r>
+          </w:p>
+        </w:tc>
+      </w:tr>
+      <w:tr>
+        <w:tc>
+          <w:tcPr>
+            <w:tcW w:w="2400" w:type="dxa"/>
+          </w:tcPr>
+          <w:p>
+            <w:r>
+              <w:t>16</w:t>
             </w:r>
           </w:p>
         </w:tc>
@@ -1140,39 +1428,39 @@
           </w:tcPr>
           <w:p>
             <w:r>
-              <w:t>0.458</w:t>
-            </w:r>
-          </w:p>
-        </w:tc>
-        <w:tc>
-          <w:tcPr>
-            <w:tcW w:w="2400" w:type="dxa"/>
-          </w:tcPr>
-          <w:p>
-            <w:r>
-              <w:t>asyncio</w:t>
-            </w:r>
-          </w:p>
-        </w:tc>
-        <w:tc>
-          <w:tcPr>
-            <w:tcW w:w="2400" w:type="dxa"/>
-          </w:tcPr>
-          <w:p>
-            <w:r>
-              <w:t>-</w:t>
-            </w:r>
-          </w:p>
-        </w:tc>
-      </w:tr>
-      <w:tr>
-        <w:tc>
-          <w:tcPr>
-            <w:tcW w:w="2400" w:type="dxa"/>
-          </w:tcPr>
-          <w:p>
-            <w:r>
-              <w:t>13</w:t>
+              <w:t>0.777</w:t>
+            </w:r>
+          </w:p>
+        </w:tc>
+        <w:tc>
+          <w:tcPr>
+            <w:tcW w:w="2400" w:type="dxa"/>
+          </w:tcPr>
+          <w:p>
+            <w:r>
+              <w:t>asyncio</w:t>
+            </w:r>
+          </w:p>
+        </w:tc>
+        <w:tc>
+          <w:tcPr>
+            <w:tcW w:w="2400" w:type="dxa"/>
+          </w:tcPr>
+          <w:p>
+            <w:r>
+              <w:t>-</w:t>
+            </w:r>
+          </w:p>
+        </w:tc>
+      </w:tr>
+      <w:tr>
+        <w:tc>
+          <w:tcPr>
+            <w:tcW w:w="2400" w:type="dxa"/>
+          </w:tcPr>
+          <w:p>
+            <w:r>
+              <w:t>17</w:t>
             </w:r>
           </w:p>
         </w:tc>
@@ -1212,39 +1500,39 @@
           </w:tcPr>
           <w:p>
             <w:r>
-              <w:t>0.229</w:t>
-            </w:r>
-          </w:p>
-        </w:tc>
-        <w:tc>
-          <w:tcPr>
-            <w:tcW w:w="2400" w:type="dxa"/>
-          </w:tcPr>
-          <w:p>
-            <w:r>
-              <w:t>asyncio</w:t>
-            </w:r>
-          </w:p>
-        </w:tc>
-        <w:tc>
-          <w:tcPr>
-            <w:tcW w:w="2400" w:type="dxa"/>
-          </w:tcPr>
-          <w:p>
-            <w:r>
-              <w:t>-</w:t>
-            </w:r>
-          </w:p>
-        </w:tc>
-      </w:tr>
-      <w:tr>
-        <w:tc>
-          <w:tcPr>
-            <w:tcW w:w="2400" w:type="dxa"/>
-          </w:tcPr>
-          <w:p>
-            <w:r>
-              <w:t>14</w:t>
+              <w:t>0.416</w:t>
+            </w:r>
+          </w:p>
+        </w:tc>
+        <w:tc>
+          <w:tcPr>
+            <w:tcW w:w="2400" w:type="dxa"/>
+          </w:tcPr>
+          <w:p>
+            <w:r>
+              <w:t>asyncio</w:t>
+            </w:r>
+          </w:p>
+        </w:tc>
+        <w:tc>
+          <w:tcPr>
+            <w:tcW w:w="2400" w:type="dxa"/>
+          </w:tcPr>
+          <w:p>
+            <w:r>
+              <w:t>-</w:t>
+            </w:r>
+          </w:p>
+        </w:tc>
+      </w:tr>
+      <w:tr>
+        <w:tc>
+          <w:tcPr>
+            <w:tcW w:w="2400" w:type="dxa"/>
+          </w:tcPr>
+          <w:p>
+            <w:r>
+              <w:t>18</w:t>
             </w:r>
           </w:p>
         </w:tc>
@@ -1284,39 +1572,39 @@
           </w:tcPr>
           <w:p>
             <w:r>
-              <w:t>0.448</w:t>
-            </w:r>
-          </w:p>
-        </w:tc>
-        <w:tc>
-          <w:tcPr>
-            <w:tcW w:w="2400" w:type="dxa"/>
-          </w:tcPr>
-          <w:p>
-            <w:r>
-              <w:t>asyncio</w:t>
-            </w:r>
-          </w:p>
-        </w:tc>
-        <w:tc>
-          <w:tcPr>
-            <w:tcW w:w="2400" w:type="dxa"/>
-          </w:tcPr>
-          <w:p>
-            <w:r>
-              <w:t>-</w:t>
-            </w:r>
-          </w:p>
-        </w:tc>
-      </w:tr>
-      <w:tr>
-        <w:tc>
-          <w:tcPr>
-            <w:tcW w:w="2400" w:type="dxa"/>
-          </w:tcPr>
-          <w:p>
-            <w:r>
-              <w:t>15</w:t>
+              <w:t>0.790</w:t>
+            </w:r>
+          </w:p>
+        </w:tc>
+        <w:tc>
+          <w:tcPr>
+            <w:tcW w:w="2400" w:type="dxa"/>
+          </w:tcPr>
+          <w:p>
+            <w:r>
+              <w:t>asyncio</w:t>
+            </w:r>
+          </w:p>
+        </w:tc>
+        <w:tc>
+          <w:tcPr>
+            <w:tcW w:w="2400" w:type="dxa"/>
+          </w:tcPr>
+          <w:p>
+            <w:r>
+              <w:t>-</w:t>
+            </w:r>
+          </w:p>
+        </w:tc>
+      </w:tr>
+      <w:tr>
+        <w:tc>
+          <w:tcPr>
+            <w:tcW w:w="2400" w:type="dxa"/>
+          </w:tcPr>
+          <w:p>
+            <w:r>
+              <w:t>19</w:t>
             </w:r>
           </w:p>
         </w:tc>
@@ -1356,39 +1644,39 @@
           </w:tcPr>
           <w:p>
             <w:r>
-              <w:t>0.451</w:t>
-            </w:r>
-          </w:p>
-        </w:tc>
-        <w:tc>
-          <w:tcPr>
-            <w:tcW w:w="2400" w:type="dxa"/>
-          </w:tcPr>
-          <w:p>
-            <w:r>
-              <w:t>asyncio</w:t>
-            </w:r>
-          </w:p>
-        </w:tc>
-        <w:tc>
-          <w:tcPr>
-            <w:tcW w:w="2400" w:type="dxa"/>
-          </w:tcPr>
-          <w:p>
-            <w:r>
-              <w:t>-</w:t>
-            </w:r>
-          </w:p>
-        </w:tc>
-      </w:tr>
-      <w:tr>
-        <w:tc>
-          <w:tcPr>
-            <w:tcW w:w="2400" w:type="dxa"/>
-          </w:tcPr>
-          <w:p>
-            <w:r>
-              <w:t>16</w:t>
+              <w:t>0.891</w:t>
+            </w:r>
+          </w:p>
+        </w:tc>
+        <w:tc>
+          <w:tcPr>
+            <w:tcW w:w="2400" w:type="dxa"/>
+          </w:tcPr>
+          <w:p>
+            <w:r>
+              <w:t>asyncio</w:t>
+            </w:r>
+          </w:p>
+        </w:tc>
+        <w:tc>
+          <w:tcPr>
+            <w:tcW w:w="2400" w:type="dxa"/>
+          </w:tcPr>
+          <w:p>
+            <w:r>
+              <w:t>-</w:t>
+            </w:r>
+          </w:p>
+        </w:tc>
+      </w:tr>
+      <w:tr>
+        <w:tc>
+          <w:tcPr>
+            <w:tcW w:w="2400" w:type="dxa"/>
+          </w:tcPr>
+          <w:p>
+            <w:r>
+              <w:t>20</w:t>
             </w:r>
           </w:p>
         </w:tc>
@@ -1428,39 +1716,39 @@
           </w:tcPr>
           <w:p>
             <w:r>
-              <w:t>0.224</w:t>
-            </w:r>
-          </w:p>
-        </w:tc>
-        <w:tc>
-          <w:tcPr>
-            <w:tcW w:w="2400" w:type="dxa"/>
-          </w:tcPr>
-          <w:p>
-            <w:r>
-              <w:t>asyncio</w:t>
-            </w:r>
-          </w:p>
-        </w:tc>
-        <w:tc>
-          <w:tcPr>
-            <w:tcW w:w="2400" w:type="dxa"/>
-          </w:tcPr>
-          <w:p>
-            <w:r>
-              <w:t>-</w:t>
-            </w:r>
-          </w:p>
-        </w:tc>
-      </w:tr>
-      <w:tr>
-        <w:tc>
-          <w:tcPr>
-            <w:tcW w:w="2400" w:type="dxa"/>
-          </w:tcPr>
-          <w:p>
-            <w:r>
-              <w:t>17</w:t>
+              <w:t>0.401</w:t>
+            </w:r>
+          </w:p>
+        </w:tc>
+        <w:tc>
+          <w:tcPr>
+            <w:tcW w:w="2400" w:type="dxa"/>
+          </w:tcPr>
+          <w:p>
+            <w:r>
+              <w:t>asyncio</w:t>
+            </w:r>
+          </w:p>
+        </w:tc>
+        <w:tc>
+          <w:tcPr>
+            <w:tcW w:w="2400" w:type="dxa"/>
+          </w:tcPr>
+          <w:p>
+            <w:r>
+              <w:t>-</w:t>
+            </w:r>
+          </w:p>
+        </w:tc>
+      </w:tr>
+      <w:tr>
+        <w:tc>
+          <w:tcPr>
+            <w:tcW w:w="2400" w:type="dxa"/>
+          </w:tcPr>
+          <w:p>
+            <w:r>
+              <w:t>21</w:t>
             </w:r>
           </w:p>
         </w:tc>
@@ -1500,39 +1788,39 @@
           </w:tcPr>
           <w:p>
             <w:r>
-              <w:t>0.221</w:t>
-            </w:r>
-          </w:p>
-        </w:tc>
-        <w:tc>
-          <w:tcPr>
-            <w:tcW w:w="2400" w:type="dxa"/>
-          </w:tcPr>
-          <w:p>
-            <w:r>
-              <w:t>asyncio</w:t>
-            </w:r>
-          </w:p>
-        </w:tc>
-        <w:tc>
-          <w:tcPr>
-            <w:tcW w:w="2400" w:type="dxa"/>
-          </w:tcPr>
-          <w:p>
-            <w:r>
-              <w:t>-</w:t>
-            </w:r>
-          </w:p>
-        </w:tc>
-      </w:tr>
-      <w:tr>
-        <w:tc>
-          <w:tcPr>
-            <w:tcW w:w="2400" w:type="dxa"/>
-          </w:tcPr>
-          <w:p>
-            <w:r>
-              <w:t>18</w:t>
+              <w:t>0.423</w:t>
+            </w:r>
+          </w:p>
+        </w:tc>
+        <w:tc>
+          <w:tcPr>
+            <w:tcW w:w="2400" w:type="dxa"/>
+          </w:tcPr>
+          <w:p>
+            <w:r>
+              <w:t>asyncio</w:t>
+            </w:r>
+          </w:p>
+        </w:tc>
+        <w:tc>
+          <w:tcPr>
+            <w:tcW w:w="2400" w:type="dxa"/>
+          </w:tcPr>
+          <w:p>
+            <w:r>
+              <w:t>-</w:t>
+            </w:r>
+          </w:p>
+        </w:tc>
+      </w:tr>
+      <w:tr>
+        <w:tc>
+          <w:tcPr>
+            <w:tcW w:w="2400" w:type="dxa"/>
+          </w:tcPr>
+          <w:p>
+            <w:r>
+              <w:t>22</w:t>
             </w:r>
           </w:p>
         </w:tc>
@@ -1572,39 +1860,39 @@
           </w:tcPr>
           <w:p>
             <w:r>
-              <w:t>0.551</w:t>
-            </w:r>
-          </w:p>
-        </w:tc>
-        <w:tc>
-          <w:tcPr>
-            <w:tcW w:w="2400" w:type="dxa"/>
-          </w:tcPr>
-          <w:p>
-            <w:r>
-              <w:t>asyncio</w:t>
-            </w:r>
-          </w:p>
-        </w:tc>
-        <w:tc>
-          <w:tcPr>
-            <w:tcW w:w="2400" w:type="dxa"/>
-          </w:tcPr>
-          <w:p>
-            <w:r>
-              <w:t>-</w:t>
-            </w:r>
-          </w:p>
-        </w:tc>
-      </w:tr>
-      <w:tr>
-        <w:tc>
-          <w:tcPr>
-            <w:tcW w:w="2400" w:type="dxa"/>
-          </w:tcPr>
-          <w:p>
-            <w:r>
-              <w:t>19</w:t>
+              <w:t>0.796</w:t>
+            </w:r>
+          </w:p>
+        </w:tc>
+        <w:tc>
+          <w:tcPr>
+            <w:tcW w:w="2400" w:type="dxa"/>
+          </w:tcPr>
+          <w:p>
+            <w:r>
+              <w:t>asyncio</w:t>
+            </w:r>
+          </w:p>
+        </w:tc>
+        <w:tc>
+          <w:tcPr>
+            <w:tcW w:w="2400" w:type="dxa"/>
+          </w:tcPr>
+          <w:p>
+            <w:r>
+              <w:t>-</w:t>
+            </w:r>
+          </w:p>
+        </w:tc>
+      </w:tr>
+      <w:tr>
+        <w:tc>
+          <w:tcPr>
+            <w:tcW w:w="2400" w:type="dxa"/>
+          </w:tcPr>
+          <w:p>
+            <w:r>
+              <w:t>23</w:t>
             </w:r>
           </w:p>
         </w:tc>
@@ -1644,39 +1932,39 @@
           </w:tcPr>
           <w:p>
             <w:r>
-              <w:t>0.482</w:t>
-            </w:r>
-          </w:p>
-        </w:tc>
-        <w:tc>
-          <w:tcPr>
-            <w:tcW w:w="2400" w:type="dxa"/>
-          </w:tcPr>
-          <w:p>
-            <w:r>
-              <w:t>asyncio</w:t>
-            </w:r>
-          </w:p>
-        </w:tc>
-        <w:tc>
-          <w:tcPr>
-            <w:tcW w:w="2400" w:type="dxa"/>
-          </w:tcPr>
-          <w:p>
-            <w:r>
-              <w:t>-</w:t>
-            </w:r>
-          </w:p>
-        </w:tc>
-      </w:tr>
-      <w:tr>
-        <w:tc>
-          <w:tcPr>
-            <w:tcW w:w="2400" w:type="dxa"/>
-          </w:tcPr>
-          <w:p>
-            <w:r>
-              <w:t>20</w:t>
+              <w:t>0.817</w:t>
+            </w:r>
+          </w:p>
+        </w:tc>
+        <w:tc>
+          <w:tcPr>
+            <w:tcW w:w="2400" w:type="dxa"/>
+          </w:tcPr>
+          <w:p>
+            <w:r>
+              <w:t>asyncio</w:t>
+            </w:r>
+          </w:p>
+        </w:tc>
+        <w:tc>
+          <w:tcPr>
+            <w:tcW w:w="2400" w:type="dxa"/>
+          </w:tcPr>
+          <w:p>
+            <w:r>
+              <w:t>-</w:t>
+            </w:r>
+          </w:p>
+        </w:tc>
+      </w:tr>
+      <w:tr>
+        <w:tc>
+          <w:tcPr>
+            <w:tcW w:w="2400" w:type="dxa"/>
+          </w:tcPr>
+          <w:p>
+            <w:r>
+              <w:t>24</w:t>
             </w:r>
           </w:p>
         </w:tc>
@@ -1716,39 +2004,39 @@
           </w:tcPr>
           <w:p>
             <w:r>
-              <w:t>0.453</w:t>
-            </w:r>
-          </w:p>
-        </w:tc>
-        <w:tc>
-          <w:tcPr>
-            <w:tcW w:w="2400" w:type="dxa"/>
-          </w:tcPr>
-          <w:p>
-            <w:r>
-              <w:t>asyncio</w:t>
-            </w:r>
-          </w:p>
-        </w:tc>
-        <w:tc>
-          <w:tcPr>
-            <w:tcW w:w="2400" w:type="dxa"/>
-          </w:tcPr>
-          <w:p>
-            <w:r>
-              <w:t>-</w:t>
-            </w:r>
-          </w:p>
-        </w:tc>
-      </w:tr>
-      <w:tr>
-        <w:tc>
-          <w:tcPr>
-            <w:tcW w:w="2400" w:type="dxa"/>
-          </w:tcPr>
-          <w:p>
-            <w:r>
-              <w:t>21</w:t>
+              <w:t>0.834</w:t>
+            </w:r>
+          </w:p>
+        </w:tc>
+        <w:tc>
+          <w:tcPr>
+            <w:tcW w:w="2400" w:type="dxa"/>
+          </w:tcPr>
+          <w:p>
+            <w:r>
+              <w:t>asyncio</w:t>
+            </w:r>
+          </w:p>
+        </w:tc>
+        <w:tc>
+          <w:tcPr>
+            <w:tcW w:w="2400" w:type="dxa"/>
+          </w:tcPr>
+          <w:p>
+            <w:r>
+              <w:t>-</w:t>
+            </w:r>
+          </w:p>
+        </w:tc>
+      </w:tr>
+      <w:tr>
+        <w:tc>
+          <w:tcPr>
+            <w:tcW w:w="2400" w:type="dxa"/>
+          </w:tcPr>
+          <w:p>
+            <w:r>
+              <w:t>25</w:t>
             </w:r>
           </w:p>
         </w:tc>
@@ -1788,7 +2076,7 @@
           </w:tcPr>
           <w:p>
             <w:r>
-              <w:t>0.463</w:t>
+              <w:t>0.785</w:t>
             </w:r>
           </w:p>
         </w:tc>

</xml_diff>